<commit_message>
Updated user personas as per team feedback.
</commit_message>
<xml_diff>
--- a/docs/plan/User Personas.docx
+++ b/docs/plan/User Personas.docx
@@ -6,11 +6,15 @@
       <w:tblPr>
         <w:tblStyle w:val="TableGrid"/>
         <w:tblW w:w="13264" w:type="dxa"/>
+        <w:tblBorders>
+          <w:insideH w:val="none" w:sz="0" w:space="0" w:color="auto"/>
+          <w:insideV w:val="none" w:sz="0" w:space="0" w:color="auto"/>
+        </w:tblBorders>
         <w:tblLook w:val="04A0" w:firstRow="1" w:lastRow="0" w:firstColumn="1" w:lastColumn="0" w:noHBand="0" w:noVBand="1"/>
       </w:tblPr>
       <w:tblGrid>
-        <w:gridCol w:w="5665"/>
-        <w:gridCol w:w="7599"/>
+        <w:gridCol w:w="5886"/>
+        <w:gridCol w:w="7378"/>
       </w:tblGrid>
       <w:tr>
         <w:trPr>
@@ -18,7 +22,7 @@
         </w:trPr>
         <w:tc>
           <w:tcPr>
-            <w:tcW w:w="5665" w:type="dxa"/>
+            <w:tcW w:w="5886" w:type="dxa"/>
           </w:tcPr>
           <w:p>
             <w:pPr>
@@ -40,6 +44,27 @@
                 <w:sz w:val="28"/>
                 <w:szCs w:val="28"/>
               </w:rPr>
+              <w:t>Student</w:t>
+            </w:r>
+          </w:p>
+          <w:p>
+            <w:pPr>
+              <w:rPr>
+                <w:rFonts w:ascii="Calibri" w:hAnsi="Calibri" w:cs="Calibri"/>
+                <w:noProof/>
+                <w:sz w:val="22"/>
+                <w:szCs w:val="22"/>
+              </w:rPr>
+            </w:pPr>
+            <w:r>
+              <w:rPr>
+                <w:rFonts w:ascii="Calibri" w:hAnsi="Calibri" w:cs="Calibri"/>
+                <w:b/>
+                <w:bCs/>
+                <w:noProof/>
+                <w:sz w:val="28"/>
+                <w:szCs w:val="28"/>
+              </w:rPr>
               <w:t>Mei Guo</w:t>
             </w:r>
           </w:p>
@@ -47,22 +72,23 @@
             <w:pPr>
               <w:rPr>
                 <w:rFonts w:ascii="Calibri" w:hAnsi="Calibri" w:cs="Calibri"/>
-                <w:sz w:val="22"/>
-                <w:szCs w:val="22"/>
-              </w:rPr>
-            </w:pPr>
-            <w:r>
-              <w:rPr>
-                <w:rFonts w:ascii="Calibri" w:hAnsi="Calibri" w:cs="Calibri"/>
                 <w:noProof/>
                 <w:sz w:val="22"/>
                 <w:szCs w:val="22"/>
               </w:rPr>
+            </w:pPr>
+            <w:r>
+              <w:rPr>
+                <w:rFonts w:ascii="Calibri" w:hAnsi="Calibri" w:cs="Calibri"/>
+                <w:noProof/>
+                <w:sz w:val="22"/>
+                <w:szCs w:val="22"/>
+              </w:rPr>
               <w:drawing>
-                <wp:inline distT="0" distB="0" distL="0" distR="0" wp14:anchorId="690FD1BA" wp14:editId="6DFD50BA">
-                  <wp:extent cx="3240000" cy="2397600"/>
-                  <wp:effectExtent l="0" t="0" r="0" b="3175"/>
-                  <wp:docPr id="2138823112" name="Picture 1" descr="A person sitting at a desk with books and a computer&#10;&#10;AI-generated content may be incorrect."/>
+                <wp:inline distT="0" distB="0" distL="0" distR="0" wp14:anchorId="1ABC4C97" wp14:editId="61A84706">
+                  <wp:extent cx="3600000" cy="2707200"/>
+                  <wp:effectExtent l="0" t="0" r="635" b="0"/>
+                  <wp:docPr id="1740874406" name="Picture 9" descr="A person sitting at a desk typing on a keyboard&#10;&#10;AI-generated content may be incorrect."/>
                   <wp:cNvGraphicFramePr>
                     <a:graphicFrameLocks xmlns:a="http://schemas.openxmlformats.org/drawingml/2006/main" noChangeAspect="1"/>
                   </wp:cNvGraphicFramePr>
@@ -70,38 +96,29 @@
                     <a:graphicData uri="http://schemas.openxmlformats.org/drawingml/2006/picture">
                       <pic:pic xmlns:pic="http://schemas.openxmlformats.org/drawingml/2006/picture">
                         <pic:nvPicPr>
-                          <pic:cNvPr id="2138823112" name="Picture 1" descr="A person sitting at a desk with books and a computer&#10;&#10;AI-generated content may be incorrect."/>
+                          <pic:cNvPr id="1740874406" name="Picture 9" descr="A person sitting at a desk typing on a keyboard&#10;&#10;AI-generated content may be incorrect."/>
                           <pic:cNvPicPr/>
                         </pic:nvPicPr>
-                        <pic:blipFill rotWithShape="1">
-                          <a:blip r:embed="rId6">
+                        <pic:blipFill>
+                          <a:blip r:embed="rId6" cstate="print">
                             <a:extLst>
                               <a:ext uri="{28A0092B-C50C-407E-A947-70E740481C1C}">
                                 <a14:useLocalDpi xmlns:a14="http://schemas.microsoft.com/office/drawing/2010/main" val="0"/>
                               </a:ext>
                             </a:extLst>
                           </a:blip>
-                          <a:srcRect l="9534"/>
                           <a:stretch>
                             <a:fillRect/>
                           </a:stretch>
                         </pic:blipFill>
-                        <pic:spPr bwMode="auto">
+                        <pic:spPr>
                           <a:xfrm>
                             <a:off x="0" y="0"/>
-                            <a:ext cx="3240000" cy="2397600"/>
+                            <a:ext cx="3600000" cy="2707200"/>
                           </a:xfrm>
                           <a:prstGeom prst="rect">
                             <a:avLst/>
                           </a:prstGeom>
-                          <a:ln>
-                            <a:noFill/>
-                          </a:ln>
-                          <a:extLst>
-                            <a:ext uri="{53640926-AAD7-44D8-BBD7-CCE9431645EC}">
-                              <a14:shadowObscured xmlns:a14="http://schemas.microsoft.com/office/drawing/2010/main"/>
-                            </a:ext>
-                          </a:extLst>
                         </pic:spPr>
                       </pic:pic>
                     </a:graphicData>
@@ -114,6 +131,15 @@
             <w:pPr>
               <w:rPr>
                 <w:rFonts w:ascii="Calibri" w:hAnsi="Calibri" w:cs="Calibri"/>
+                <w:sz w:val="22"/>
+                <w:szCs w:val="22"/>
+              </w:rPr>
+            </w:pPr>
+          </w:p>
+          <w:p>
+            <w:pPr>
+              <w:rPr>
+                <w:rFonts w:ascii="Calibri" w:hAnsi="Calibri" w:cs="Calibri"/>
                 <w:i/>
                 <w:iCs/>
                 <w:sz w:val="22"/>
@@ -128,7 +154,47 @@
                 <w:sz w:val="22"/>
                 <w:szCs w:val="22"/>
               </w:rPr>
-              <w:t>“I love advancing my research in quantum mechanics, but balancing my Ph.D. work and being a mom can be overwhelming sometimes.”</w:t>
+              <w:t xml:space="preserve">“I love advancing my research in </w:t>
+            </w:r>
+            <w:r>
+              <w:rPr>
+                <w:rFonts w:ascii="Calibri" w:hAnsi="Calibri" w:cs="Calibri"/>
+                <w:i/>
+                <w:iCs/>
+                <w:sz w:val="22"/>
+                <w:szCs w:val="22"/>
+              </w:rPr>
+              <w:t>Mathematics,</w:t>
+            </w:r>
+            <w:r>
+              <w:rPr>
+                <w:rFonts w:ascii="Calibri" w:hAnsi="Calibri" w:cs="Calibri"/>
+                <w:i/>
+                <w:iCs/>
+                <w:sz w:val="22"/>
+                <w:szCs w:val="22"/>
+              </w:rPr>
+              <w:t xml:space="preserve"> but balancing my </w:t>
+            </w:r>
+            <w:r>
+              <w:rPr>
+                <w:rFonts w:ascii="Calibri" w:hAnsi="Calibri" w:cs="Calibri"/>
+                <w:i/>
+                <w:iCs/>
+                <w:sz w:val="22"/>
+                <w:szCs w:val="22"/>
+              </w:rPr>
+              <w:t>graduate</w:t>
+            </w:r>
+            <w:r>
+              <w:rPr>
+                <w:rFonts w:ascii="Calibri" w:hAnsi="Calibri" w:cs="Calibri"/>
+                <w:i/>
+                <w:iCs/>
+                <w:sz w:val="22"/>
+                <w:szCs w:val="22"/>
+              </w:rPr>
+              <w:t xml:space="preserve"> work and being a mom can be overwhelming sometimes.”</w:t>
             </w:r>
           </w:p>
           <w:p>
@@ -235,7 +301,23 @@
                 <w:sz w:val="22"/>
                 <w:szCs w:val="22"/>
               </w:rPr>
-              <w:t xml:space="preserve"> Ph.D. student and mother</w:t>
+              <w:t xml:space="preserve"> </w:t>
+            </w:r>
+            <w:r>
+              <w:rPr>
+                <w:rFonts w:ascii="Calibri" w:hAnsi="Calibri" w:cs="Calibri"/>
+                <w:sz w:val="22"/>
+                <w:szCs w:val="22"/>
+              </w:rPr>
+              <w:t>Graduate</w:t>
+            </w:r>
+            <w:r>
+              <w:rPr>
+                <w:rFonts w:ascii="Calibri" w:hAnsi="Calibri" w:cs="Calibri"/>
+                <w:sz w:val="22"/>
+                <w:szCs w:val="22"/>
+              </w:rPr>
+              <w:t xml:space="preserve"> student and mother</w:t>
             </w:r>
             <w:r>
               <w:rPr>
@@ -261,7 +343,23 @@
                 <w:sz w:val="22"/>
                 <w:szCs w:val="22"/>
               </w:rPr>
-              <w:t xml:space="preserve"> Graduate student in Mathematics, juggling research, teaching assistant work, and caring for her two-year-old child; lives with her partner near campus</w:t>
+              <w:t xml:space="preserve"> </w:t>
+            </w:r>
+            <w:r>
+              <w:rPr>
+                <w:rFonts w:ascii="Calibri" w:hAnsi="Calibri" w:cs="Calibri"/>
+                <w:sz w:val="22"/>
+                <w:szCs w:val="22"/>
+              </w:rPr>
+              <w:t xml:space="preserve">Graduate </w:t>
+            </w:r>
+            <w:r>
+              <w:rPr>
+                <w:rFonts w:ascii="Calibri" w:hAnsi="Calibri" w:cs="Calibri"/>
+                <w:sz w:val="22"/>
+                <w:szCs w:val="22"/>
+              </w:rPr>
+              <w:t>student in Mathematics, juggling research, teaching assistant work, and caring for her two-year-old child; lives with her partner near campus</w:t>
             </w:r>
             <w:r>
               <w:rPr>
@@ -275,7 +373,7 @@
         </w:tc>
         <w:tc>
           <w:tcPr>
-            <w:tcW w:w="7599" w:type="dxa"/>
+            <w:tcW w:w="7378" w:type="dxa"/>
           </w:tcPr>
           <w:p>
             <w:pPr>
@@ -648,7 +746,6 @@
         </w:tc>
       </w:tr>
     </w:tbl>
-    <w:p/>
     <w:p/>
     <w:tbl>
       <w:tblPr>
@@ -687,6 +784,27 @@
                 <w:szCs w:val="28"/>
               </w:rPr>
               <w:lastRenderedPageBreak/>
+              <w:t>Student</w:t>
+            </w:r>
+          </w:p>
+          <w:p>
+            <w:pPr>
+              <w:rPr>
+                <w:rFonts w:ascii="Calibri" w:hAnsi="Calibri" w:cs="Calibri"/>
+                <w:b/>
+                <w:bCs/>
+                <w:sz w:val="28"/>
+                <w:szCs w:val="28"/>
+              </w:rPr>
+            </w:pPr>
+            <w:r>
+              <w:rPr>
+                <w:rFonts w:ascii="Calibri" w:hAnsi="Calibri" w:cs="Calibri"/>
+                <w:b/>
+                <w:bCs/>
+                <w:sz w:val="28"/>
+                <w:szCs w:val="28"/>
+              </w:rPr>
               <w:t>Ben Jackson</w:t>
             </w:r>
           </w:p>
@@ -1403,6 +1521,27 @@
                 <w:szCs w:val="28"/>
               </w:rPr>
               <w:lastRenderedPageBreak/>
+              <w:t>Instructor</w:t>
+            </w:r>
+          </w:p>
+          <w:p>
+            <w:pPr>
+              <w:rPr>
+                <w:rFonts w:ascii="Calibri" w:hAnsi="Calibri" w:cs="Calibri"/>
+                <w:b/>
+                <w:bCs/>
+                <w:sz w:val="28"/>
+                <w:szCs w:val="28"/>
+              </w:rPr>
+            </w:pPr>
+            <w:r>
+              <w:rPr>
+                <w:rFonts w:ascii="Calibri" w:hAnsi="Calibri" w:cs="Calibri"/>
+                <w:b/>
+                <w:bCs/>
+                <w:sz w:val="28"/>
+                <w:szCs w:val="28"/>
+              </w:rPr>
               <w:t>Fatm</w:t>
             </w:r>
             <w:r>
@@ -2098,20 +2237,6 @@
           </w:p>
         </w:tc>
       </w:tr>
-    </w:tbl>
-    <w:p/>
-    <w:p/>
-    <w:p/>
-    <w:tbl>
-      <w:tblPr>
-        <w:tblStyle w:val="TableGrid"/>
-        <w:tblW w:w="13264" w:type="dxa"/>
-        <w:tblLook w:val="04A0" w:firstRow="1" w:lastRow="0" w:firstColumn="1" w:lastColumn="0" w:noHBand="0" w:noVBand="1"/>
-      </w:tblPr>
-      <w:tblGrid>
-        <w:gridCol w:w="5665"/>
-        <w:gridCol w:w="7599"/>
-      </w:tblGrid>
       <w:tr>
         <w:trPr>
           <w:trHeight w:val="4739"/>
@@ -2120,6 +2245,28 @@
           <w:tcPr>
             <w:tcW w:w="5665" w:type="dxa"/>
           </w:tcPr>
+          <w:p>
+            <w:pPr>
+              <w:rPr>
+                <w:rFonts w:ascii="Calibri" w:hAnsi="Calibri" w:cs="Calibri"/>
+                <w:b/>
+                <w:bCs/>
+                <w:sz w:val="28"/>
+                <w:szCs w:val="28"/>
+              </w:rPr>
+            </w:pPr>
+            <w:r>
+              <w:rPr>
+                <w:rFonts w:ascii="Calibri" w:hAnsi="Calibri" w:cs="Calibri"/>
+                <w:b/>
+                <w:bCs/>
+                <w:sz w:val="28"/>
+                <w:szCs w:val="28"/>
+              </w:rPr>
+              <w:lastRenderedPageBreak/>
+              <w:t>TA Coordinator</w:t>
+            </w:r>
+          </w:p>
           <w:p>
             <w:pPr>
               <w:rPr>
@@ -2879,6 +3026,28 @@
           <w:tcPr>
             <w:tcW w:w="5665" w:type="dxa"/>
           </w:tcPr>
+          <w:p>
+            <w:pPr>
+              <w:rPr>
+                <w:rFonts w:ascii="Calibri" w:hAnsi="Calibri" w:cs="Calibri"/>
+                <w:b/>
+                <w:bCs/>
+                <w:sz w:val="28"/>
+                <w:szCs w:val="28"/>
+              </w:rPr>
+            </w:pPr>
+            <w:r>
+              <w:rPr>
+                <w:rFonts w:ascii="Calibri" w:hAnsi="Calibri" w:cs="Calibri"/>
+                <w:b/>
+                <w:bCs/>
+                <w:sz w:val="28"/>
+                <w:szCs w:val="28"/>
+              </w:rPr>
+              <w:lastRenderedPageBreak/>
+              <w:t>TA Coordinator Staff</w:t>
+            </w:r>
+          </w:p>
           <w:p>
             <w:pPr>
               <w:rPr>

</xml_diff>